<commit_message>
add offline qr generator, auto draft save, duplicate invoice and gst fields
</commit_message>
<xml_diff>
--- a/Lab Manual Docs/Exp_10_Automated_Testing_Pytest_Unittest.docx
+++ b/Lab Manual Docs/Exp_10_Automated_Testing_Pytest_Unittest.docx
@@ -2594,10 +2594,12 @@
               <w:br/>
               <w:t>test_tc_val_02_invalid_phone (__main__.TestInvoiceEngine) ... ok</w:t>
               <w:br/>
+              <w:t>test_tc_words_01_indian_denominations (__main__.TestInvoiceEngine) ... ok</w:t>
+              <w:br/>
               <w:br/>
               <w:t>----------------------------------------------------------------------</w:t>
               <w:br/>
-              <w:t>Ran 12 tests in 0.001s</w:t>
+              <w:t>Ran 13 tests in 0.001s</w:t>
               <w:br/>
               <w:br/>
               <w:t>OK (100% Passing)</w:t>
@@ -2623,7 +2625,7 @@
     </w:p>
     <w:p>
       <w:r>
-        <w:t>Experiment 10 successfully verified Ledgerly's core business logic through an automated test plan. All 12 test cases executed cleanly, providing reliable regression protection against calculation discrepancies.</w:t>
+        <w:t>Experiment 10 successfully verified Ledgerly's core business logic through an automated test plan. All 13 test cases executed cleanly, providing reliable regression protection against calculation discrepancies.</w:t>
       </w:r>
     </w:p>
     <w:sectPr>

</xml_diff>